<commit_message>
Add English public pages and localized resume downloads
</commit_message>
<xml_diff>
--- a/site/resume.docx
+++ b/site/resume.docx
@@ -80,7 +80,7 @@
               <w:keepNext w:val="false"/>
               <w:spacing w:after="45" w:before="0" w:line="190"/>
             </w:pPr>
-            <w:hyperlink w:history="1" r:id="rId9ynjpmb47z9_t86feos2g">
+            <w:hyperlink w:history="1" r:id="rIdyhutjweshdtnhq8m7ryli">
               <w:r>
                 <w:rPr>
                   <w:color w:val="315CBB"/>
@@ -98,7 +98,7 @@
               </w:rPr>
               <w:t xml:space="preserve">   </w:t>
             </w:r>
-            <w:hyperlink w:history="1" r:id="rIdknpebydvqo_rv9rq6tme1">
+            <w:hyperlink w:history="1" r:id="rId8sr9jexcev_smes3uds41">
               <w:r>
                 <w:rPr>
                   <w:color w:val="315CBB"/>
@@ -116,7 +116,7 @@
               </w:rPr>
               <w:t xml:space="preserve">   </w:t>
             </w:r>
-            <w:hyperlink w:history="1" r:id="rIdlj54becxrlrvgqvcmtwv-">
+            <w:hyperlink w:history="1" r:id="rIdvddmffiqb_j_npsa__rcb">
               <w:r>
                 <w:rPr>
                   <w:color w:val="315CBB"/>
@@ -134,7 +134,7 @@
               </w:rPr>
               <w:t xml:space="preserve">   </w:t>
             </w:r>
-            <w:hyperlink w:history="1" r:id="rIdznpwzajeooo-i2lz-ot86">
+            <w:hyperlink w:history="1" r:id="rIdfc_gkub1mdpzlj03p16so">
               <w:r>
                 <w:rPr>
                   <w:color w:val="315CBB"/>
@@ -422,7 +422,7 @@
               <w:keepNext w:val="false"/>
               <w:spacing w:after="45" w:before="0" w:line="190"/>
             </w:pPr>
-            <w:hyperlink w:history="1" r:id="rIdxywd0zbqap9izi2wzasy7">
+            <w:hyperlink w:history="1" r:id="rIdiidiqjowlvhcurtitycmk">
               <w:r>
                 <w:rPr>
                   <w:color w:val="315CBB"/>
@@ -440,7 +440,7 @@
               </w:rPr>
               <w:t xml:space="preserve">   </w:t>
             </w:r>
-            <w:hyperlink w:history="1" r:id="rIdxmwagrpq-hvaqxjhsw-as">
+            <w:hyperlink w:history="1" r:id="rIdlbmm9j7iosikfa9jxlzm8">
               <w:r>
                 <w:rPr>
                   <w:color w:val="315CBB"/>
@@ -861,7 +861,7 @@
               <w:keepNext w:val="false"/>
               <w:spacing w:after="45" w:before="0" w:line="190"/>
             </w:pPr>
-            <w:hyperlink w:history="1" r:id="rId9_ajwmkplvkdakhnga0da">
+            <w:hyperlink w:history="1" r:id="rIdejyx4rhq3xb2zon7licka">
               <w:r>
                 <w:rPr>
                   <w:color w:val="315CBB"/>
@@ -879,7 +879,7 @@
               </w:rPr>
               <w:t xml:space="preserve">   </w:t>
             </w:r>
-            <w:hyperlink w:history="1" r:id="rId4f2sb9rd6g0mxt9c7hlvf">
+            <w:hyperlink w:history="1" r:id="rIdvyzshdmt5hnodaufuwupc">
               <w:r>
                 <w:rPr>
                   <w:color w:val="315CBB"/>
@@ -897,7 +897,7 @@
               </w:rPr>
               <w:t xml:space="preserve">   </w:t>
             </w:r>
-            <w:hyperlink w:history="1" r:id="rIdvb3xqy-5kptux8l6jaahz">
+            <w:hyperlink w:history="1" r:id="rIdywqckomhd_u_7u0urilss">
               <w:r>
                 <w:rPr>
                   <w:color w:val="315CBB"/>
@@ -915,7 +915,7 @@
               </w:rPr>
               <w:t xml:space="preserve">   </w:t>
             </w:r>
-            <w:hyperlink w:history="1" r:id="rIdwxqsp0ny7x9ufjrynf1tv">
+            <w:hyperlink w:history="1" r:id="rIdgsxguskcyl0-4fhjbucob">
               <w:r>
                 <w:rPr>
                   <w:color w:val="315CBB"/>
@@ -1132,7 +1132,7 @@
               <w:keepNext w:val="false"/>
               <w:spacing w:after="45" w:before="0" w:line="190"/>
             </w:pPr>
-            <w:hyperlink w:history="1" r:id="rId2rfxlpapz_e1tys0g4m07">
+            <w:hyperlink w:history="1" r:id="rIdjf5djy_vrubcwtws0xgn0">
               <w:r>
                 <w:rPr>
                   <w:color w:val="315CBB"/>
@@ -1397,7 +1397,7 @@
               <w:keepNext w:val="false"/>
               <w:spacing w:after="45" w:before="0" w:line="190"/>
             </w:pPr>
-            <w:hyperlink w:history="1" r:id="rId6zplhndgfuw3j2mzfdqjs">
+            <w:hyperlink w:history="1" r:id="rIdckqlozc3bwgyiazi4e47u">
               <w:r>
                 <w:rPr>
                   <w:color w:val="315CBB"/>
@@ -1415,7 +1415,7 @@
               </w:rPr>
               <w:t xml:space="preserve">   </w:t>
             </w:r>
-            <w:hyperlink w:history="1" r:id="rIdf6x8h9ptsuiiygijopqie">
+            <w:hyperlink w:history="1" r:id="rId8iniu9-4onvpgeaanmxqw">
               <w:r>
                 <w:rPr>
                   <w:color w:val="315CBB"/>
@@ -1559,7 +1559,7 @@
               <w:keepNext w:val="false"/>
               <w:spacing w:after="45" w:before="0" w:line="190"/>
             </w:pPr>
-            <w:hyperlink w:history="1" r:id="rIdxjm5gwqk1ti1vadcvf52y">
+            <w:hyperlink w:history="1" r:id="rIds88j8p1tb0tocrp_ggmjg">
               <w:r>
                 <w:rPr>
                   <w:color w:val="315CBB"/>
@@ -1577,7 +1577,7 @@
               </w:rPr>
               <w:t xml:space="preserve">   </w:t>
             </w:r>
-            <w:hyperlink w:history="1" r:id="rId_hefguet6c7w8q8jdzs-b">
+            <w:hyperlink w:history="1" r:id="rIdopcfn1mn4vonzbvohxffv">
               <w:r>
                 <w:rPr>
                   <w:color w:val="315CBB"/>
@@ -1595,7 +1595,7 @@
               </w:rPr>
               <w:t xml:space="preserve">   </w:t>
             </w:r>
-            <w:hyperlink w:history="1" r:id="rIdzjxm86g6twvzxy-zfvs4n">
+            <w:hyperlink w:history="1" r:id="rIdy6gp1sbnvhajo6-ozxmcy">
               <w:r>
                 <w:rPr>
                   <w:color w:val="315CBB"/>
@@ -1706,14 +1706,14 @@
                     <w:keepNext w:val="false"/>
                     <w:spacing w:after="45" w:before="0" w:line="190"/>
                   </w:pPr>
-                  <w:hyperlink w:history="1" r:id="rIdx8ooqjsbjelezgn2bmii2">
+                  <w:hyperlink w:history="1" r:id="rIdi2bcyp3qrwmxwbwswwpkb">
                     <w:r>
                       <w:drawing>
                         <wp:inline distT="0" distB="0" distL="0" distR="0">
                           <wp:extent cx="466725" cy="647700"/>
                           <wp:effectExtent t="0" r="0" b="0" l="0"/>
                           <wp:docPr id="1" name="" descr="" title="">
-                            <a:hlinkClick xmlns:a="http://schemas.openxmlformats.org/drawingml/2006/main" r:id="rIdx8ooqjsbjelezgn2bmii2"/>
+                            <a:hlinkClick xmlns:a="http://schemas.openxmlformats.org/drawingml/2006/main" r:id="rIdi2bcyp3qrwmxwbwswwpkb"/>
                           </wp:docPr>
                           <wp:cNvGraphicFramePr>
                             <a:graphicFrameLocks xmlns:a="http://schemas.openxmlformats.org/drawingml/2006/main" noChangeAspect="1"/>
@@ -1723,7 +1723,7 @@
                               <pic:pic xmlns:pic="http://schemas.openxmlformats.org/drawingml/2006/picture">
                                 <pic:nvPicPr>
                                   <pic:cNvPr id="0" name="" descr="">
-                                    <a:hlinkClick r:id="rIdx8ooqjsbjelezgn2bmii2"/>
+                                    <a:hlinkClick r:id="rIdi2bcyp3qrwmxwbwswwpkb"/>
                                   </pic:cNvPr>
                                   <pic:cNvPicPr>
                                     <a:picLocks noChangeAspect="1" noChangeArrowheads="1"/>
@@ -1908,14 +1908,14 @@
                     <w:keepNext w:val="false"/>
                     <w:spacing w:after="45" w:before="0" w:line="190"/>
                   </w:pPr>
-                  <w:hyperlink w:history="1" r:id="rIdamhxhrmi5sdtnf1hj4els">
+                  <w:hyperlink w:history="1" r:id="rIdud-m9ux0obzy5n3jayrwm">
                     <w:r>
                       <w:drawing>
                         <wp:inline distT="0" distB="0" distL="0" distR="0">
                           <wp:extent cx="533400" cy="400050"/>
                           <wp:effectExtent t="0" r="0" b="0" l="0"/>
                           <wp:docPr id="1" name="" descr="" title="">
-                            <a:hlinkClick xmlns:a="http://schemas.openxmlformats.org/drawingml/2006/main" r:id="rIdamhxhrmi5sdtnf1hj4els"/>
+                            <a:hlinkClick xmlns:a="http://schemas.openxmlformats.org/drawingml/2006/main" r:id="rIdud-m9ux0obzy5n3jayrwm"/>
                           </wp:docPr>
                           <wp:cNvGraphicFramePr>
                             <a:graphicFrameLocks xmlns:a="http://schemas.openxmlformats.org/drawingml/2006/main" noChangeAspect="1"/>
@@ -1925,7 +1925,7 @@
                               <pic:pic xmlns:pic="http://schemas.openxmlformats.org/drawingml/2006/picture">
                                 <pic:nvPicPr>
                                   <pic:cNvPr id="0" name="" descr="">
-                                    <a:hlinkClick r:id="rIdamhxhrmi5sdtnf1hj4els"/>
+                                    <a:hlinkClick r:id="rIdud-m9ux0obzy5n3jayrwm"/>
                                   </pic:cNvPr>
                                   <pic:cNvPicPr>
                                     <a:picLocks noChangeAspect="1" noChangeArrowheads="1"/>
@@ -2151,7 +2151,7 @@
               <w:br/>
               <w:t xml:space="preserve"/>
             </w:r>
-            <w:hyperlink w:history="1" r:id="rId802bjgta1dhs_-_e4stx2">
+            <w:hyperlink w:history="1" r:id="rIdubhmptyseovimhycb09n6">
               <w:r>
                 <w:rPr>
                   <w:color w:val="315CBB"/>
@@ -2161,7 +2161,7 @@
                 <w:t xml:space="preserve">개인 쇼핑몰 · 로그인 구현 ↗</w:t>
               </w:r>
             </w:hyperlink>
-            <w:hyperlink w:history="1" r:id="rIdowja6xrxmufar_rntkbzb">
+            <w:hyperlink w:history="1" r:id="rIdfq0cogur15wykrb4flniw">
               <w:r>
                 <w:rPr>
                   <w:color w:val="315CBB"/>
@@ -2796,14 +2796,14 @@
                     <w:keepNext w:val="false"/>
                     <w:spacing w:after="45" w:before="0" w:line="190"/>
                   </w:pPr>
-                  <w:hyperlink w:history="1" r:id="rId9en5xvv0vyfoyith8in_d">
+                  <w:hyperlink w:history="1" r:id="rIdftklfjx-qgpglrjkg8bjm">
                     <w:r>
                       <w:drawing>
                         <wp:inline distT="0" distB="0" distL="0" distR="0">
                           <wp:extent cx="457200" cy="647700"/>
                           <wp:effectExtent t="0" r="0" b="0" l="0"/>
                           <wp:docPr id="1" name="" descr="" title="">
-                            <a:hlinkClick xmlns:a="http://schemas.openxmlformats.org/drawingml/2006/main" r:id="rId9en5xvv0vyfoyith8in_d"/>
+                            <a:hlinkClick xmlns:a="http://schemas.openxmlformats.org/drawingml/2006/main" r:id="rIdftklfjx-qgpglrjkg8bjm"/>
                           </wp:docPr>
                           <wp:cNvGraphicFramePr>
                             <a:graphicFrameLocks xmlns:a="http://schemas.openxmlformats.org/drawingml/2006/main" noChangeAspect="1"/>
@@ -2813,7 +2813,7 @@
                               <pic:pic xmlns:pic="http://schemas.openxmlformats.org/drawingml/2006/picture">
                                 <pic:nvPicPr>
                                   <pic:cNvPr id="0" name="" descr="">
-                                    <a:hlinkClick r:id="rId9en5xvv0vyfoyith8in_d"/>
+                                    <a:hlinkClick r:id="rIdftklfjx-qgpglrjkg8bjm"/>
                                   </pic:cNvPr>
                                   <pic:cNvPicPr>
                                     <a:picLocks noChangeAspect="1" noChangeArrowheads="1"/>
@@ -2995,14 +2995,14 @@
                     <w:keepNext w:val="false"/>
                     <w:spacing w:after="45" w:before="0" w:line="190"/>
                   </w:pPr>
-                  <w:hyperlink w:history="1" r:id="rIdzztb69cgj1xvemkbf8itk">
+                  <w:hyperlink w:history="1" r:id="rIdkod2zhaucs9uqpod8cdoq">
                     <w:r>
                       <w:drawing>
                         <wp:inline distT="0" distB="0" distL="0" distR="0">
                           <wp:extent cx="457200" cy="647700"/>
                           <wp:effectExtent t="0" r="0" b="0" l="0"/>
                           <wp:docPr id="1" name="" descr="" title="">
-                            <a:hlinkClick xmlns:a="http://schemas.openxmlformats.org/drawingml/2006/main" r:id="rIdzztb69cgj1xvemkbf8itk"/>
+                            <a:hlinkClick xmlns:a="http://schemas.openxmlformats.org/drawingml/2006/main" r:id="rIdkod2zhaucs9uqpod8cdoq"/>
                           </wp:docPr>
                           <wp:cNvGraphicFramePr>
                             <a:graphicFrameLocks xmlns:a="http://schemas.openxmlformats.org/drawingml/2006/main" noChangeAspect="1"/>
@@ -3012,7 +3012,7 @@
                               <pic:pic xmlns:pic="http://schemas.openxmlformats.org/drawingml/2006/picture">
                                 <pic:nvPicPr>
                                   <pic:cNvPr id="0" name="" descr="">
-                                    <a:hlinkClick r:id="rIdzztb69cgj1xvemkbf8itk"/>
+                                    <a:hlinkClick r:id="rIdkod2zhaucs9uqpod8cdoq"/>
                                   </pic:cNvPr>
                                   <pic:cNvPicPr>
                                     <a:picLocks noChangeAspect="1" noChangeArrowheads="1"/>
@@ -3194,14 +3194,14 @@
                     <w:keepNext w:val="false"/>
                     <w:spacing w:after="45" w:before="0" w:line="190"/>
                   </w:pPr>
-                  <w:hyperlink w:history="1" r:id="rIdllyfku6lj12u1txv15i3s">
+                  <w:hyperlink w:history="1" r:id="rIdld-cpwpxst6ot3mv97_9x">
                     <w:r>
                       <w:drawing>
                         <wp:inline distT="0" distB="0" distL="0" distR="0">
                           <wp:extent cx="457200" cy="647700"/>
                           <wp:effectExtent t="0" r="0" b="0" l="0"/>
                           <wp:docPr id="1" name="" descr="" title="">
-                            <a:hlinkClick xmlns:a="http://schemas.openxmlformats.org/drawingml/2006/main" r:id="rIdllyfku6lj12u1txv15i3s"/>
+                            <a:hlinkClick xmlns:a="http://schemas.openxmlformats.org/drawingml/2006/main" r:id="rIdld-cpwpxst6ot3mv97_9x"/>
                           </wp:docPr>
                           <wp:cNvGraphicFramePr>
                             <a:graphicFrameLocks xmlns:a="http://schemas.openxmlformats.org/drawingml/2006/main" noChangeAspect="1"/>
@@ -3211,7 +3211,7 @@
                               <pic:pic xmlns:pic="http://schemas.openxmlformats.org/drawingml/2006/picture">
                                 <pic:nvPicPr>
                                   <pic:cNvPr id="0" name="" descr="">
-                                    <a:hlinkClick r:id="rIdllyfku6lj12u1txv15i3s"/>
+                                    <a:hlinkClick r:id="rIdld-cpwpxst6ot3mv97_9x"/>
                                   </pic:cNvPr>
                                   <pic:cNvPicPr>
                                     <a:picLocks noChangeAspect="1" noChangeArrowheads="1"/>
@@ -3393,14 +3393,14 @@
                     <w:keepNext w:val="false"/>
                     <w:spacing w:after="45" w:before="0" w:line="190"/>
                   </w:pPr>
-                  <w:hyperlink w:history="1" r:id="rIduivauvuhatysbzeroiyyr">
+                  <w:hyperlink w:history="1" r:id="rIdgpgrowen3g32pkjdwjfxe">
                     <w:r>
                       <w:drawing>
                         <wp:inline distT="0" distB="0" distL="0" distR="0">
                           <wp:extent cx="457200" cy="647700"/>
                           <wp:effectExtent t="0" r="0" b="0" l="0"/>
                           <wp:docPr id="1" name="" descr="" title="">
-                            <a:hlinkClick xmlns:a="http://schemas.openxmlformats.org/drawingml/2006/main" r:id="rIduivauvuhatysbzeroiyyr"/>
+                            <a:hlinkClick xmlns:a="http://schemas.openxmlformats.org/drawingml/2006/main" r:id="rIdgpgrowen3g32pkjdwjfxe"/>
                           </wp:docPr>
                           <wp:cNvGraphicFramePr>
                             <a:graphicFrameLocks xmlns:a="http://schemas.openxmlformats.org/drawingml/2006/main" noChangeAspect="1"/>
@@ -3410,7 +3410,7 @@
                               <pic:pic xmlns:pic="http://schemas.openxmlformats.org/drawingml/2006/picture">
                                 <pic:nvPicPr>
                                   <pic:cNvPr id="0" name="" descr="">
-                                    <a:hlinkClick r:id="rIduivauvuhatysbzeroiyyr"/>
+                                    <a:hlinkClick r:id="rIdgpgrowen3g32pkjdwjfxe"/>
                                   </pic:cNvPr>
                                   <pic:cNvPicPr>
                                     <a:picLocks noChangeAspect="1" noChangeArrowheads="1"/>

</xml_diff>